<commit_message>
docs(academic): revise LOI + CV for ASU DEng submission — 6 of 8 edits applied (SunCodes year pending confirmation, HIPAA/Sprint edits N/A in current CV version)
</commit_message>
<xml_diff>
--- a/academic/CV_MegMontanezDavenport.docx
+++ b/academic/CV_MegMontanezDavenport.docx
@@ -492,20 +492,10 @@
       </w:pPr>
       <w:r>
         <w:rPr>
-          <w:rFonts w:ascii="Arial" w:cs="Arial" w:eastAsia="Arial" w:hAnsi="Arial"/>
-          <w:color w:val="2E86C1"/>
-          <w:sz w:val="20"/>
-          <w:szCs w:val="20"/>
-        </w:rPr>
-        <w:t xml:space="preserve">•  </w:t>
-      </w:r>
-      <w:r>
-        <w:rPr>
-          <w:rFonts w:ascii="Arial" w:cs="Arial" w:eastAsia="Arial" w:hAnsi="Arial"/>
-          <w:sz w:val="20"/>
-          <w:szCs w:val="20"/>
-        </w:rPr>
-        <w:t xml:space="preserve">Designed and deployed 27 browser-based therapeutic interaction modules across neurotransmitter-based engagement tiers.</w:t>
+          <w:rFonts w:ascii="Arial" w:hAnsi="Arial"/>
+          <w:sz w:val="20"/>
+        </w:rPr>
+        <w:t>•  Architected and deployed a tier-based therapeutic game framework — currently operating with three flagship demos (one per level: L1 Theta Wave/GABA, L2 Biochemical/Serotonin, L3 Original Frequency/Endocannabinoid) demonstrating the full participant flow: wallet gating, HNT token rewards, on-chain achievement minting, and NFT-based tier access. Architecture supports expansion to full catalog and roadmap targets VR-mediated avatar circle integration.</w:t>
       </w:r>
     </w:p>
     <w:p>
@@ -927,6 +917,17 @@
         <w:spacing w:after="30" w:before="0"/>
       </w:pPr>
     </w:p>
+    <w:p>
+      <w:r>
+        <w:t>Practice Operations Lead</w:t>
+      </w:r>
+    </w:p>
+    <w:p>
+      <w:r>
+        <w:t>Riccobene Associates	2019 - 2025</w:t>
+      </w:r>
+    </w:p>
+    <w:p/>
     <w:p>
       <w:pPr>
         <w:spacing w:after="10" w:before="120"/>
@@ -1105,32 +1106,7 @@
         <w:spacing w:after="20" w:before="100"/>
       </w:pPr>
       <w:r>
-        <w:rPr>
-          <w:rFonts w:ascii="Arial" w:cs="Arial" w:eastAsia="Arial" w:hAnsi="Arial"/>
-          <w:b/>
-          <w:bCs/>
-          <w:sz w:val="21"/>
-          <w:szCs w:val="21"/>
-        </w:rPr>
-        <w:t xml:space="preserve">Bachelor of Science, Management Information Systems</w:t>
-      </w:r>
-      <w:r>
-        <w:rPr>
-          <w:rFonts w:ascii="Arial" w:cs="Arial" w:eastAsia="Arial" w:hAnsi="Arial"/>
-          <w:color w:val="888888"/>
-          <w:sz w:val="20"/>
-          <w:szCs w:val="20"/>
-        </w:rPr>
-        <w:t xml:space="preserve">  |  </w:t>
-      </w:r>
-      <w:r>
-        <w:rPr>
-          <w:rFonts w:ascii="Arial" w:cs="Arial" w:eastAsia="Arial" w:hAnsi="Arial"/>
-          <w:color w:val="444444"/>
-          <w:sz w:val="20"/>
-          <w:szCs w:val="20"/>
-        </w:rPr>
-        <w:t xml:space="preserve">Colorado State University Global (HLC Accredited)</w:t>
+        <w:t>Bachelor of Science, Management Information Systems  |  Colorado State University Global (HLC Accredited)  |  Conferred July 2026</w:t>
       </w:r>
     </w:p>
     <w:p>
@@ -2087,6 +2063,30 @@
         <w:spacing w:after="60" w:before="120"/>
       </w:pPr>
     </w:p>
+    <w:p>
+      <w:r>
+        <w:rPr>
+          <w:b/>
+        </w:rPr>
+        <w:t>RESEARCH</w:t>
+      </w:r>
+    </w:p>
+    <w:p>
+      <w:r>
+        <w:t>EIP-191 Consent Architecture for Sovereign Behavioral Health Data Governance — Lead Author</w:t>
+      </w:r>
+    </w:p>
+    <w:p>
+      <w:r>
+        <w:t>Manuscript in preparation; target journal: Blockchain in Healthcare Today (BHTY)</w:t>
+      </w:r>
+    </w:p>
+    <w:p>
+      <w:r>
+        <w:t>Establishes the EIP-191 wallet-signature consent pattern as a generalizable architecture for sovereign data governance, with regulated behavioral health as the deliberate stress-test domain. Documents the implementation deployed in SovereignLedger v2 (Sepolia: 0x4afA577fA914068451e0Aa97b61F23960f02aCc4).</w:t>
+      </w:r>
+    </w:p>
+    <w:p/>
     <w:p>
       <w:pPr>
         <w:spacing w:after="40" w:before="180"/>

</xml_diff>